<commit_message>
Rebuild PRE SOPs — remove italic Why: label (template fix retrofit)
Reruns build_pre_sops_v2.py against the already-fixed
sop_record_common.py so PRE's SOP body text drops the "Why:" label
in the same way PSQ/HIC/IMS already do. No content or source
changes — mechanical re-render only. Records regenerated alongside
since the chapter's build script rebuilds everything together.

This is the last of the 7 pre-fix chapters (FMS, ROM, AAC, HRM, COP,
MOM, PRE) retrofitted — all 10 of 10 SHCO chapters are now uniform,
with no "Why:" label anywhere.

Co-Authored-By: Claude Sonnet 5 <noreply@anthropic.com>
Claude-Session: https://claude.ai/code/session_016VFLsECWt4VArpBiaqgrgF
</commit_message>
<xml_diff>
--- a/policies/build/sop_record_masters/PRE/SOP_PRE.1.a_to_e_patient_family_rights_responsibilities.docx
+++ b/policies/build/sop_record_masters/PRE/SOP_PRE.1.a_to_e_patient_family_rights_responsibilities.docx
@@ -208,12 +208,6 @@
     </w:p>
     <w:p>
       <w:r>
-        <w:rPr>
-          <w:i/>
-        </w:rPr>
-        <w:t xml:space="preserve">Why: </w:t>
-      </w:r>
-      <w:r>
         <w:t>so entry, ward care and leadership review all work from the same current rights set, not separate private understandings of what patients are owed.</w:t>
       </w:r>
     </w:p>
@@ -231,12 +225,6 @@
       </w:r>
     </w:p>
     <w:p>
-      <w:r>
-        <w:rPr>
-          <w:i/>
-        </w:rPr>
-        <w:t xml:space="preserve">Why: </w:t>
-      </w:r>
       <w:r>
         <w:t>a rights charter nobody at the top ever reviews is a poster, not a governance system -- the point of leadership review is that a repeated violation gets caught and fixed, not quietly absorbed.</w:t>
       </w:r>
@@ -336,12 +324,6 @@
     </w:p>
     <w:p>
       <w:r>
-        <w:rPr>
-          <w:i/>
-        </w:rPr>
-        <w:t xml:space="preserve">Why: </w:t>
-      </w:r>
-      <w:r>
         <w:t>A rights charter that only the quality office has ever seen, or a board behind the clerk that patients never pass, protects no one -- a right a patient was never told about is not a right they can exercise.</w:t>
       </w:r>
     </w:p>
@@ -375,12 +357,6 @@
     </w:p>
     <w:p>
       <w:r>
-        <w:rPr>
-          <w:i/>
-        </w:rPr>
-        <w:t xml:space="preserve">Why: </w:t>
-      </w:r>
-      <w:r>
         <w:t>A poster read once at induction and never mentioned again is not promotion -- a right only becomes real for a patient when it is named at the moment it actually matters: before consent, during a refusal, when a complaint is invited, when cost is explained.</w:t>
       </w:r>
     </w:p>
@@ -408,12 +384,6 @@
       </w:r>
     </w:p>
     <w:p>
-      <w:r>
-        <w:rPr>
-          <w:i/>
-        </w:rPr>
-        <w:t xml:space="preserve">Why: </w:t>
-      </w:r>
       <w:r>
         <w:t>Protection is not a quality slogan -- it is the daily discipline of not doing what the documented set forbids: not examining without privacy, not ignoring a refusal, not withholding the treating doctor's name, not punishing a complaint.</w:t>
       </w:r>
@@ -443,12 +413,6 @@
     </w:p>
     <w:p>
       <w:r>
-        <w:rPr>
-          <w:i/>
-        </w:rPr>
-        <w:t xml:space="preserve">Why: </w:t>
-      </w:r>
-      <w:r>
         <w:t>A report that can only be made to the very person alleged to have committed the violation is not a mechanism -- it is a dead end that teaches patients and staff that reporting is pointless.</w:t>
       </w:r>
     </w:p>
@@ -476,12 +440,6 @@
       </w:r>
     </w:p>
     <w:p>
-      <w:r>
-        <w:rPr>
-          <w:i/>
-        </w:rPr>
-        <w:t xml:space="preserve">Why: </w:t>
-      </w:r>
       <w:r>
         <w:t>A violation file nobody above the ward ever opens is not monitoring -- the point of leadership review is catching a repeated setting or a repeated right before it becomes a pattern no one noticed.</w:t>
       </w:r>

</xml_diff>